<commit_message>
new lighthouse for all pages
</commit_message>
<xml_diff>
--- a/lighthouse  test for pages.docx
+++ b/lighthouse  test for pages.docx
@@ -9,6 +9,9 @@
     </w:p>
     <w:p>
       <w:r>
+        <w:rPr>
+          <w:noProof/>
+        </w:rPr>
         <w:drawing>
           <wp:inline distT="0" distB="0" distL="0" distR="0" wp14:anchorId="7B611E9C" wp14:editId="178837DF">
             <wp:extent cx="5731510" cy="2832735"/>
@@ -53,7 +56,7 @@
           <w:noProof/>
         </w:rPr>
         <w:drawing>
-          <wp:inline distT="0" distB="0" distL="0" distR="0" wp14:anchorId="13B7A488" wp14:editId="4DB68CC1">
+          <wp:inline distT="0" distB="0" distL="0" distR="0" wp14:anchorId="13B7A488" wp14:editId="31C66F23">
             <wp:extent cx="6279143" cy="3144520"/>
             <wp:effectExtent l="0" t="0" r="7620" b="0"/>
             <wp:docPr id="1568118824" name="Picture 1"/>
@@ -114,6 +117,9 @@
     <w:p/>
     <w:p>
       <w:r>
+        <w:rPr>
+          <w:noProof/>
+        </w:rPr>
         <w:drawing>
           <wp:inline distT="0" distB="0" distL="0" distR="0" wp14:anchorId="2E33ABC9" wp14:editId="4101D26D">
             <wp:extent cx="5731510" cy="2797810"/>
@@ -153,6 +159,9 @@
     </w:p>
     <w:p>
       <w:r>
+        <w:rPr>
+          <w:noProof/>
+        </w:rPr>
         <w:drawing>
           <wp:inline distT="0" distB="0" distL="0" distR="0" wp14:anchorId="7ABAD016" wp14:editId="47DF401F">
             <wp:extent cx="5731510" cy="2748280"/>
@@ -178,6 +187,242 @@
                     <a:xfrm>
                       <a:off x="0" y="0"/>
                       <a:ext cx="5731510" cy="2748280"/>
+                    </a:xfrm>
+                    <a:prstGeom prst="rect">
+                      <a:avLst/>
+                    </a:prstGeom>
+                  </pic:spPr>
+                </pic:pic>
+              </a:graphicData>
+            </a:graphic>
+          </wp:inline>
+        </w:drawing>
+      </w:r>
+    </w:p>
+    <w:p>
+      <w:r>
+        <w:lastRenderedPageBreak/>
+        <w:drawing>
+          <wp:inline distT="0" distB="0" distL="0" distR="0" wp14:anchorId="6BE07F6F" wp14:editId="4BD1D359">
+            <wp:extent cx="5731510" cy="2966085"/>
+            <wp:effectExtent l="0" t="0" r="2540" b="5715"/>
+            <wp:docPr id="1076241339" name="Picture 1"/>
+            <wp:cNvGraphicFramePr>
+              <a:graphicFrameLocks xmlns:a="http://schemas.openxmlformats.org/drawingml/2006/main" noChangeAspect="1"/>
+            </wp:cNvGraphicFramePr>
+            <a:graphic xmlns:a="http://schemas.openxmlformats.org/drawingml/2006/main">
+              <a:graphicData uri="http://schemas.openxmlformats.org/drawingml/2006/picture">
+                <pic:pic xmlns:pic="http://schemas.openxmlformats.org/drawingml/2006/picture">
+                  <pic:nvPicPr>
+                    <pic:cNvPr id="1076241339" name=""/>
+                    <pic:cNvPicPr/>
+                  </pic:nvPicPr>
+                  <pic:blipFill>
+                    <a:blip r:embed="rId8"/>
+                    <a:stretch>
+                      <a:fillRect/>
+                    </a:stretch>
+                  </pic:blipFill>
+                  <pic:spPr>
+                    <a:xfrm>
+                      <a:off x="0" y="0"/>
+                      <a:ext cx="5731510" cy="2966085"/>
+                    </a:xfrm>
+                    <a:prstGeom prst="rect">
+                      <a:avLst/>
+                    </a:prstGeom>
+                  </pic:spPr>
+                </pic:pic>
+              </a:graphicData>
+            </a:graphic>
+          </wp:inline>
+        </w:drawing>
+      </w:r>
+    </w:p>
+    <w:p>
+      <w:r>
+        <w:drawing>
+          <wp:inline distT="0" distB="0" distL="0" distR="0" wp14:anchorId="079A1F7F" wp14:editId="7DDFA8A4">
+            <wp:extent cx="5731510" cy="2712085"/>
+            <wp:effectExtent l="0" t="0" r="2540" b="0"/>
+            <wp:docPr id="7251058" name="Picture 1"/>
+            <wp:cNvGraphicFramePr>
+              <a:graphicFrameLocks xmlns:a="http://schemas.openxmlformats.org/drawingml/2006/main" noChangeAspect="1"/>
+            </wp:cNvGraphicFramePr>
+            <a:graphic xmlns:a="http://schemas.openxmlformats.org/drawingml/2006/main">
+              <a:graphicData uri="http://schemas.openxmlformats.org/drawingml/2006/picture">
+                <pic:pic xmlns:pic="http://schemas.openxmlformats.org/drawingml/2006/picture">
+                  <pic:nvPicPr>
+                    <pic:cNvPr id="7251058" name=""/>
+                    <pic:cNvPicPr/>
+                  </pic:nvPicPr>
+                  <pic:blipFill>
+                    <a:blip r:embed="rId9"/>
+                    <a:stretch>
+                      <a:fillRect/>
+                    </a:stretch>
+                  </pic:blipFill>
+                  <pic:spPr>
+                    <a:xfrm>
+                      <a:off x="0" y="0"/>
+                      <a:ext cx="5731510" cy="2712085"/>
+                    </a:xfrm>
+                    <a:prstGeom prst="rect">
+                      <a:avLst/>
+                    </a:prstGeom>
+                  </pic:spPr>
+                </pic:pic>
+              </a:graphicData>
+            </a:graphic>
+          </wp:inline>
+        </w:drawing>
+      </w:r>
+    </w:p>
+    <w:p>
+      <w:r>
+        <w:drawing>
+          <wp:inline distT="0" distB="0" distL="0" distR="0" wp14:anchorId="1C648331" wp14:editId="1E8DE680">
+            <wp:extent cx="5731510" cy="2780030"/>
+            <wp:effectExtent l="0" t="0" r="2540" b="1270"/>
+            <wp:docPr id="730133214" name="Picture 1"/>
+            <wp:cNvGraphicFramePr>
+              <a:graphicFrameLocks xmlns:a="http://schemas.openxmlformats.org/drawingml/2006/main" noChangeAspect="1"/>
+            </wp:cNvGraphicFramePr>
+            <a:graphic xmlns:a="http://schemas.openxmlformats.org/drawingml/2006/main">
+              <a:graphicData uri="http://schemas.openxmlformats.org/drawingml/2006/picture">
+                <pic:pic xmlns:pic="http://schemas.openxmlformats.org/drawingml/2006/picture">
+                  <pic:nvPicPr>
+                    <pic:cNvPr id="730133214" name=""/>
+                    <pic:cNvPicPr/>
+                  </pic:nvPicPr>
+                  <pic:blipFill>
+                    <a:blip r:embed="rId10"/>
+                    <a:stretch>
+                      <a:fillRect/>
+                    </a:stretch>
+                  </pic:blipFill>
+                  <pic:spPr>
+                    <a:xfrm>
+                      <a:off x="0" y="0"/>
+                      <a:ext cx="5731510" cy="2780030"/>
+                    </a:xfrm>
+                    <a:prstGeom prst="rect">
+                      <a:avLst/>
+                    </a:prstGeom>
+                  </pic:spPr>
+                </pic:pic>
+              </a:graphicData>
+            </a:graphic>
+          </wp:inline>
+        </w:drawing>
+      </w:r>
+    </w:p>
+    <w:p>
+      <w:r>
+        <w:lastRenderedPageBreak/>
+        <w:drawing>
+          <wp:inline distT="0" distB="0" distL="0" distR="0" wp14:anchorId="2FDEFC2C" wp14:editId="1B14B503">
+            <wp:extent cx="5731510" cy="2744470"/>
+            <wp:effectExtent l="0" t="0" r="2540" b="0"/>
+            <wp:docPr id="1696459987" name="Picture 1"/>
+            <wp:cNvGraphicFramePr>
+              <a:graphicFrameLocks xmlns:a="http://schemas.openxmlformats.org/drawingml/2006/main" noChangeAspect="1"/>
+            </wp:cNvGraphicFramePr>
+            <a:graphic xmlns:a="http://schemas.openxmlformats.org/drawingml/2006/main">
+              <a:graphicData uri="http://schemas.openxmlformats.org/drawingml/2006/picture">
+                <pic:pic xmlns:pic="http://schemas.openxmlformats.org/drawingml/2006/picture">
+                  <pic:nvPicPr>
+                    <pic:cNvPr id="1696459987" name=""/>
+                    <pic:cNvPicPr/>
+                  </pic:nvPicPr>
+                  <pic:blipFill>
+                    <a:blip r:embed="rId11"/>
+                    <a:stretch>
+                      <a:fillRect/>
+                    </a:stretch>
+                  </pic:blipFill>
+                  <pic:spPr>
+                    <a:xfrm>
+                      <a:off x="0" y="0"/>
+                      <a:ext cx="5731510" cy="2744470"/>
+                    </a:xfrm>
+                    <a:prstGeom prst="rect">
+                      <a:avLst/>
+                    </a:prstGeom>
+                  </pic:spPr>
+                </pic:pic>
+              </a:graphicData>
+            </a:graphic>
+          </wp:inline>
+        </w:drawing>
+      </w:r>
+    </w:p>
+    <w:p>
+      <w:r>
+        <w:drawing>
+          <wp:inline distT="0" distB="0" distL="0" distR="0" wp14:anchorId="0D4A57F5" wp14:editId="418F1C31">
+            <wp:extent cx="5731510" cy="2786380"/>
+            <wp:effectExtent l="0" t="0" r="2540" b="0"/>
+            <wp:docPr id="2001535716" name="Picture 1"/>
+            <wp:cNvGraphicFramePr>
+              <a:graphicFrameLocks xmlns:a="http://schemas.openxmlformats.org/drawingml/2006/main" noChangeAspect="1"/>
+            </wp:cNvGraphicFramePr>
+            <a:graphic xmlns:a="http://schemas.openxmlformats.org/drawingml/2006/main">
+              <a:graphicData uri="http://schemas.openxmlformats.org/drawingml/2006/picture">
+                <pic:pic xmlns:pic="http://schemas.openxmlformats.org/drawingml/2006/picture">
+                  <pic:nvPicPr>
+                    <pic:cNvPr id="2001535716" name=""/>
+                    <pic:cNvPicPr/>
+                  </pic:nvPicPr>
+                  <pic:blipFill>
+                    <a:blip r:embed="rId12"/>
+                    <a:stretch>
+                      <a:fillRect/>
+                    </a:stretch>
+                  </pic:blipFill>
+                  <pic:spPr>
+                    <a:xfrm>
+                      <a:off x="0" y="0"/>
+                      <a:ext cx="5731510" cy="2786380"/>
+                    </a:xfrm>
+                    <a:prstGeom prst="rect">
+                      <a:avLst/>
+                    </a:prstGeom>
+                  </pic:spPr>
+                </pic:pic>
+              </a:graphicData>
+            </a:graphic>
+          </wp:inline>
+        </w:drawing>
+      </w:r>
+    </w:p>
+    <w:p>
+      <w:r>
+        <w:drawing>
+          <wp:inline distT="0" distB="0" distL="0" distR="0" wp14:anchorId="59D0257A" wp14:editId="2EE0C68A">
+            <wp:extent cx="5731510" cy="2775585"/>
+            <wp:effectExtent l="0" t="0" r="2540" b="5715"/>
+            <wp:docPr id="153345824" name="Picture 1"/>
+            <wp:cNvGraphicFramePr>
+              <a:graphicFrameLocks xmlns:a="http://schemas.openxmlformats.org/drawingml/2006/main" noChangeAspect="1"/>
+            </wp:cNvGraphicFramePr>
+            <a:graphic xmlns:a="http://schemas.openxmlformats.org/drawingml/2006/main">
+              <a:graphicData uri="http://schemas.openxmlformats.org/drawingml/2006/picture">
+                <pic:pic xmlns:pic="http://schemas.openxmlformats.org/drawingml/2006/picture">
+                  <pic:nvPicPr>
+                    <pic:cNvPr id="153345824" name=""/>
+                    <pic:cNvPicPr/>
+                  </pic:nvPicPr>
+                  <pic:blipFill>
+                    <a:blip r:embed="rId13"/>
+                    <a:stretch>
+                      <a:fillRect/>
+                    </a:stretch>
+                  </pic:blipFill>
+                  <pic:spPr>
+                    <a:xfrm>
+                      <a:off x="0" y="0"/>
+                      <a:ext cx="5731510" cy="2775585"/>
                     </a:xfrm>
                     <a:prstGeom prst="rect">
                       <a:avLst/>

</xml_diff>